<commit_message>
Retrospectiva de la iteración 5 más liviana y metodología sin nota final
Co-Authored-By: Claude Sonnet 5.5 <noreply@anthropic.com>
</commit_message>
<xml_diff>
--- a/Fase 2/Evidencias Proyecto/Evidencias de documentación/Archivos Word y PDF/01_Metodologia_Declarada_y_Justificada.docx
+++ b/Fase 2/Evidencias Proyecto/Evidencias de documentación/Archivos Word y PDF/01_Metodologia_Declarada_y_Justificada.docx
@@ -2935,96 +2935,6 @@
         </w:rPr>
       </w:r>
     </w:p>
-    <w:p>
-      <w:pPr>
-        <w:pStyle w:val="Heading1"/>
-      </w:pPr>
-      <w:r>
-        <w:t>8. Nota de transparencia</w:t>
-      </w:r>
-    </w:p>
-    <w:tbl>
-      <w:tblPr>
-        <w:tblW w:type="dxa" w:w="9972"/>
-        <w:tblLook w:firstColumn="1" w:firstRow="1" w:lastColumn="0" w:lastRow="0" w:noHBand="0" w:noVBand="1" w:val="04A0"/>
-        <w:tblBorders>
-          <w:top w:val="single" w:sz="6" w:space="0" w:color="C2410C"/>
-          <w:left w:val="single" w:sz="6" w:space="0" w:color="C2410C"/>
-          <w:bottom w:val="single" w:sz="6" w:space="0" w:color="C2410C"/>
-          <w:right w:val="single" w:sz="6" w:space="0" w:color="C2410C"/>
-          <w:insideH w:val="single" w:sz="6" w:space="0" w:color="C2410C"/>
-          <w:insideV w:val="single" w:sz="6" w:space="0" w:color="C2410C"/>
-        </w:tblBorders>
-        <w:tblCellMar>
-          <w:top w:w="100" w:type="dxa"/>
-          <w:left w:w="160" w:type="dxa"/>
-          <w:bottom w:w="100" w:type="dxa"/>
-          <w:right w:w="160" w:type="dxa"/>
-        </w:tblCellMar>
-        <w:tblLayout w:type="fixed"/>
-      </w:tblPr>
-      <w:tblGrid>
-        <w:gridCol w:w="9972"/>
-      </w:tblGrid>
-      <w:tr>
-        <w:trPr>
-          <w:cantSplit/>
-        </w:trPr>
-        <w:tc>
-          <w:tcPr>
-            <w:tcW w:type="dxa" w:w="9972"/>
-            <w:shd w:val="clear" w:color="auto" w:fill="FFF7ED"/>
-          </w:tcPr>
-          <w:p>
-            <w:pPr>
-              <w:spacing w:after="40"/>
-            </w:pPr>
-            <w:r>
-              <w:rPr>
-                <w:sz w:val="21"/>
-              </w:rPr>
-              <w:t xml:space="preserve">El </w:t>
-            </w:r>
-            <w:r>
-              <w:rPr>
-                <w:b/>
-                <w:sz w:val="21"/>
-              </w:rPr>
-              <w:t>Sprint Backlog</w:t>
-            </w:r>
-            <w:r>
-              <w:rPr>
-                <w:sz w:val="21"/>
-              </w:rPr>
-              <w:t xml:space="preserve"> se reconstruyó desde el historial real de Git y las </w:t>
-            </w:r>
-            <w:r>
-              <w:rPr>
-                <w:b/>
-                <w:sz w:val="21"/>
-              </w:rPr>
-              <w:t>retrospectivas</w:t>
-            </w:r>
-            <w:r>
-              <w:rPr>
-                <w:sz w:val="21"/>
-              </w:rPr>
-              <w:t xml:space="preserve"> de las iteraciones 2 a 4 se redactaron el 01-10-2026 a partir de ese historial y de los documentos del proyecto: los hechos y las mejoras son reales, pero no se registraron en una reunión al cierre de cada iteración. Desde la iteración 5 la retrospectiva se registra al cerrar la iteración.</w:t>
-            </w:r>
-          </w:p>
-        </w:tc>
-      </w:tr>
-    </w:tbl>
-    <w:p>
-      <w:pPr>
-        <w:spacing w:after="0" w:before="0" w:line="120" w:lineRule="exact"/>
-      </w:pPr>
-      <w:r>
-        <w:rPr>
-          <w:sz w:val="12"/>
-        </w:rPr>
-      </w:r>
-    </w:p>
     <w:sectPr>
       <w:headerReference w:type="default" r:id="rId9"/>
       <w:footerReference w:type="default" r:id="rId10"/>

</xml_diff>